<commit_message>
docs: regenerate the PDF and Word of the requirements, procedure, actions and manuals
</commit_message>
<xml_diff>
--- a/07_PROCEDIMIENTO_DE_IMPLEMENTACION/EN/WORD/07_Implementation_Procedure.docx
+++ b/07_PROCEDIMIENTO_DE_IMPLEMENTACION/EN/WORD/07_Implementation_Procedure.docx
@@ -341,6 +341,52 @@
           </w:p>
         </w:tc>
       </w:tr>
+      <w:tr>
+        <w:tc>
+          <w:tcPr/>
+          <w:p>
+            <w:pPr>
+              <w:pStyle w:val="Compact"/>
+            </w:pPr>
+            <w:r>
+              <w:t xml:space="preserve">2.2</w:t>
+            </w:r>
+          </w:p>
+        </w:tc>
+        <w:tc>
+          <w:tcPr/>
+          <w:p>
+            <w:pPr>
+              <w:pStyle w:val="Compact"/>
+            </w:pPr>
+            <w:r>
+              <w:t xml:space="preserve">2026-10-19</w:t>
+            </w:r>
+          </w:p>
+        </w:tc>
+        <w:tc>
+          <w:tcPr/>
+          <w:p>
+            <w:pPr>
+              <w:pStyle w:val="Compact"/>
+            </w:pPr>
+            <w:r>
+              <w:t xml:space="preserve">Continuous integration with GitHub Actions in the 10 repositories and deployment from GitHub: the scope (6.2) and risk R-I09 were updated.</w:t>
+            </w:r>
+          </w:p>
+        </w:tc>
+        <w:tc>
+          <w:tcPr/>
+          <w:p>
+            <w:pPr>
+              <w:pStyle w:val="Compact"/>
+            </w:pPr>
+            <w:r>
+              <w:t xml:space="preserve">Development team</w:t>
+            </w:r>
+          </w:p>
+        </w:tc>
+      </w:tr>
     </w:tbl>
     <w:p>
       <w:pPr>
@@ -1533,7 +1579,7 @@
         </w:numPr>
       </w:pPr>
       <w:r>
-        <w:t xml:space="preserve">Continuous integration: Jenkins is planned but not configured (technical debt TD-006), so the release is built with the commands of section 11.3.</w:t>
+        <w:t xml:space="preserve">Setting up continuous integration: since October 19, 2026, each repository builds and runs its tests with GitHub Actions on every change, and the server update can also be launched from GitHub (Deployment Document). Phase 2 is kept to verify the release before implementing it.</w:t>
       </w:r>
     </w:p>
     <w:p>
@@ -11939,7 +11985,18 @@
               <w:pStyle w:val="Compact"/>
             </w:pPr>
             <w:r>
-              <w:t xml:space="preserve">There is still no continuous integration (TD-006), and a regression can go unnoticed.</w:t>
+              <w:t xml:space="preserve">Continuous integration does not run the end-to-end tests, which need the complete system, so a regression across services can go unnoticed.</w:t>
+            </w:r>
+          </w:p>
+        </w:tc>
+        <w:tc>
+          <w:tcPr/>
+          <w:p>
+            <w:pPr>
+              <w:pStyle w:val="Compact"/>
+            </w:pPr>
+            <w:r>
+              <w:t xml:space="preserve">Low</w:t>
             </w:r>
           </w:p>
         </w:tc>
@@ -11961,18 +12018,7 @@
               <w:pStyle w:val="Compact"/>
             </w:pPr>
             <w:r>
-              <w:t xml:space="preserve">Medium</w:t>
-            </w:r>
-          </w:p>
-        </w:tc>
-        <w:tc>
-          <w:tcPr/>
-          <w:p>
-            <w:pPr>
-              <w:pStyle w:val="Compact"/>
-            </w:pPr>
-            <w:r>
-              <w:t xml:space="preserve">Run the unit tests, the end-to-end suite, and the smoke tests before each deployment.</w:t>
+              <w:t xml:space="preserve">Confirm that GitHub Actions is green in the 10 repositories and run the end-to-end suite and the smoke tests before each deployment.</w:t>
             </w:r>
           </w:p>
         </w:tc>
@@ -12058,7 +12104,7 @@
         <w:pStyle w:val="BodyText"/>
       </w:pPr>
       <w:r>
-        <w:t xml:space="preserve">To take the system to a real production environment, in addition to the above, the following would be missing: continuous integration per repository, SQL Server and RabbitMQ hosted with the secrets in a provider vault, one database login per service instead of</w:t>
+        <w:t xml:space="preserve">To take the system to a real production environment, in addition to the above, the following would be missing: SQL Server and RabbitMQ hosted with the secrets in a provider vault, one database login per service instead of</w:t>
       </w:r>
       <w:r>
         <w:t xml:space="preserve"> </w:t>
@@ -17734,7 +17780,7 @@
       <w:color w:themeColor="accent1" w:themeShade="BF" w:val="365F91"/>
     </w:rPr>
   </w:style>
-  <w:style w:type="paragraph" w:customStyle="1" w:styleId="SourceCode">
+  <w:style w:customStyle="1" w:styleId="SourceCode" w:type="paragraph">
     <w:name w:val="Source Code"/>
     <w:basedOn w:val="Normal"/>
     <w:link w:val="VerbatimChar"/>
@@ -17742,7 +17788,7 @@
       <w:wordWrap w:val="off"/>
     </w:pPr>
   </w:style>
-  <w:style w:type="character" w:customStyle="1" w:styleId="KeywordTok">
+  <w:style w:customStyle="1" w:styleId="KeywordTok" w:type="character">
     <w:name w:val="KeywordTok"/>
     <w:basedOn w:val="VerbatimChar"/>
     <w:rPr>
@@ -17750,77 +17796,77 @@
       <w:color w:val="007020"/>
     </w:rPr>
   </w:style>
-  <w:style w:type="character" w:customStyle="1" w:styleId="DataTypeTok">
+  <w:style w:customStyle="1" w:styleId="DataTypeTok" w:type="character">
     <w:name w:val="DataTypeTok"/>
     <w:basedOn w:val="VerbatimChar"/>
     <w:rPr>
       <w:color w:val="902000"/>
     </w:rPr>
   </w:style>
-  <w:style w:type="character" w:customStyle="1" w:styleId="DecValTok">
+  <w:style w:customStyle="1" w:styleId="DecValTok" w:type="character">
     <w:name w:val="DecValTok"/>
     <w:basedOn w:val="VerbatimChar"/>
     <w:rPr>
       <w:color w:val="40a070"/>
     </w:rPr>
   </w:style>
-  <w:style w:type="character" w:customStyle="1" w:styleId="BaseNTok">
+  <w:style w:customStyle="1" w:styleId="BaseNTok" w:type="character">
     <w:name w:val="BaseNTok"/>
     <w:basedOn w:val="VerbatimChar"/>
     <w:rPr>
       <w:color w:val="40a070"/>
     </w:rPr>
   </w:style>
-  <w:style w:type="character" w:customStyle="1" w:styleId="FloatTok">
+  <w:style w:customStyle="1" w:styleId="FloatTok" w:type="character">
     <w:name w:val="FloatTok"/>
     <w:basedOn w:val="VerbatimChar"/>
     <w:rPr>
       <w:color w:val="40a070"/>
     </w:rPr>
   </w:style>
-  <w:style w:type="character" w:customStyle="1" w:styleId="ConstantTok">
+  <w:style w:customStyle="1" w:styleId="ConstantTok" w:type="character">
     <w:name w:val="ConstantTok"/>
     <w:basedOn w:val="VerbatimChar"/>
     <w:rPr>
       <w:color w:val="880000"/>
     </w:rPr>
   </w:style>
-  <w:style w:type="character" w:customStyle="1" w:styleId="CharTok">
+  <w:style w:customStyle="1" w:styleId="CharTok" w:type="character">
     <w:name w:val="CharTok"/>
     <w:basedOn w:val="VerbatimChar"/>
     <w:rPr>
       <w:color w:val="4070a0"/>
     </w:rPr>
   </w:style>
-  <w:style w:type="character" w:customStyle="1" w:styleId="SpecialCharTok">
+  <w:style w:customStyle="1" w:styleId="SpecialCharTok" w:type="character">
     <w:name w:val="SpecialCharTok"/>
     <w:basedOn w:val="VerbatimChar"/>
     <w:rPr>
       <w:color w:val="4070a0"/>
     </w:rPr>
   </w:style>
-  <w:style w:type="character" w:customStyle="1" w:styleId="StringTok">
+  <w:style w:customStyle="1" w:styleId="StringTok" w:type="character">
     <w:name w:val="StringTok"/>
     <w:basedOn w:val="VerbatimChar"/>
     <w:rPr>
       <w:color w:val="4070a0"/>
     </w:rPr>
   </w:style>
-  <w:style w:type="character" w:customStyle="1" w:styleId="VerbatimStringTok">
+  <w:style w:customStyle="1" w:styleId="VerbatimStringTok" w:type="character">
     <w:name w:val="VerbatimStringTok"/>
     <w:basedOn w:val="VerbatimChar"/>
     <w:rPr>
       <w:color w:val="4070a0"/>
     </w:rPr>
   </w:style>
-  <w:style w:type="character" w:customStyle="1" w:styleId="SpecialStringTok">
+  <w:style w:customStyle="1" w:styleId="SpecialStringTok" w:type="character">
     <w:name w:val="SpecialStringTok"/>
     <w:basedOn w:val="VerbatimChar"/>
     <w:rPr>
       <w:color w:val="bb6688"/>
     </w:rPr>
   </w:style>
-  <w:style w:type="character" w:customStyle="1" w:styleId="ImportTok">
+  <w:style w:customStyle="1" w:styleId="ImportTok" w:type="character">
     <w:name w:val="ImportTok"/>
     <w:basedOn w:val="VerbatimChar"/>
     <w:rPr>
@@ -17828,7 +17874,7 @@
       <w:color w:val="008000"/>
     </w:rPr>
   </w:style>
-  <w:style w:type="character" w:customStyle="1" w:styleId="CommentTok">
+  <w:style w:customStyle="1" w:styleId="CommentTok" w:type="character">
     <w:name w:val="CommentTok"/>
     <w:basedOn w:val="VerbatimChar"/>
     <w:rPr>
@@ -17836,7 +17882,7 @@
       <w:color w:val="60a0b0"/>
     </w:rPr>
   </w:style>
-  <w:style w:type="character" w:customStyle="1" w:styleId="DocumentationTok">
+  <w:style w:customStyle="1" w:styleId="DocumentationTok" w:type="character">
     <w:name w:val="DocumentationTok"/>
     <w:basedOn w:val="VerbatimChar"/>
     <w:rPr>
@@ -17844,7 +17890,7 @@
       <w:color w:val="ba2121"/>
     </w:rPr>
   </w:style>
-  <w:style w:type="character" w:customStyle="1" w:styleId="AnnotationTok">
+  <w:style w:customStyle="1" w:styleId="AnnotationTok" w:type="character">
     <w:name w:val="AnnotationTok"/>
     <w:basedOn w:val="VerbatimChar"/>
     <w:rPr>
@@ -17853,7 +17899,7 @@
       <w:color w:val="60a0b0"/>
     </w:rPr>
   </w:style>
-  <w:style w:type="character" w:customStyle="1" w:styleId="CommentVarTok">
+  <w:style w:customStyle="1" w:styleId="CommentVarTok" w:type="character">
     <w:name w:val="CommentVarTok"/>
     <w:basedOn w:val="VerbatimChar"/>
     <w:rPr>
@@ -17862,28 +17908,28 @@
       <w:color w:val="60a0b0"/>
     </w:rPr>
   </w:style>
-  <w:style w:type="character" w:customStyle="1" w:styleId="OtherTok">
+  <w:style w:customStyle="1" w:styleId="OtherTok" w:type="character">
     <w:name w:val="OtherTok"/>
     <w:basedOn w:val="VerbatimChar"/>
     <w:rPr>
       <w:color w:val="007020"/>
     </w:rPr>
   </w:style>
-  <w:style w:type="character" w:customStyle="1" w:styleId="FunctionTok">
+  <w:style w:customStyle="1" w:styleId="FunctionTok" w:type="character">
     <w:name w:val="FunctionTok"/>
     <w:basedOn w:val="VerbatimChar"/>
     <w:rPr>
       <w:color w:val="06287e"/>
     </w:rPr>
   </w:style>
-  <w:style w:type="character" w:customStyle="1" w:styleId="VariableTok">
+  <w:style w:customStyle="1" w:styleId="VariableTok" w:type="character">
     <w:name w:val="VariableTok"/>
     <w:basedOn w:val="VerbatimChar"/>
     <w:rPr>
       <w:color w:val="19177c"/>
     </w:rPr>
   </w:style>
-  <w:style w:type="character" w:customStyle="1" w:styleId="ControlFlowTok">
+  <w:style w:customStyle="1" w:styleId="ControlFlowTok" w:type="character">
     <w:name w:val="ControlFlowTok"/>
     <w:basedOn w:val="VerbatimChar"/>
     <w:rPr>
@@ -17891,45 +17937,45 @@
       <w:color w:val="007020"/>
     </w:rPr>
   </w:style>
-  <w:style w:type="character" w:customStyle="1" w:styleId="OperatorTok">
+  <w:style w:customStyle="1" w:styleId="OperatorTok" w:type="character">
     <w:name w:val="OperatorTok"/>
     <w:basedOn w:val="VerbatimChar"/>
     <w:rPr>
       <w:color w:val="666666"/>
     </w:rPr>
   </w:style>
-  <w:style w:type="character" w:customStyle="1" w:styleId="BuiltInTok">
+  <w:style w:customStyle="1" w:styleId="BuiltInTok" w:type="character">
     <w:name w:val="BuiltInTok"/>
     <w:basedOn w:val="VerbatimChar"/>
     <w:rPr>
       <w:color w:val="008000"/>
     </w:rPr>
   </w:style>
-  <w:style w:type="character" w:customStyle="1" w:styleId="ExtensionTok">
+  <w:style w:customStyle="1" w:styleId="ExtensionTok" w:type="character">
     <w:name w:val="ExtensionTok"/>
     <w:basedOn w:val="VerbatimChar"/>
     <w:rPr/>
   </w:style>
-  <w:style w:type="character" w:customStyle="1" w:styleId="PreprocessorTok">
+  <w:style w:customStyle="1" w:styleId="PreprocessorTok" w:type="character">
     <w:name w:val="PreprocessorTok"/>
     <w:basedOn w:val="VerbatimChar"/>
     <w:rPr>
       <w:color w:val="bc7a00"/>
     </w:rPr>
   </w:style>
-  <w:style w:type="character" w:customStyle="1" w:styleId="AttributeTok">
+  <w:style w:customStyle="1" w:styleId="AttributeTok" w:type="character">
     <w:name w:val="AttributeTok"/>
     <w:basedOn w:val="VerbatimChar"/>
     <w:rPr>
       <w:color w:val="7d9029"/>
     </w:rPr>
   </w:style>
-  <w:style w:type="character" w:customStyle="1" w:styleId="RegionMarkerTok">
+  <w:style w:customStyle="1" w:styleId="RegionMarkerTok" w:type="character">
     <w:name w:val="RegionMarkerTok"/>
     <w:basedOn w:val="VerbatimChar"/>
     <w:rPr/>
   </w:style>
-  <w:style w:type="character" w:customStyle="1" w:styleId="InformationTok">
+  <w:style w:customStyle="1" w:styleId="InformationTok" w:type="character">
     <w:name w:val="InformationTok"/>
     <w:basedOn w:val="VerbatimChar"/>
     <w:rPr>
@@ -17938,7 +17984,7 @@
       <w:color w:val="60a0b0"/>
     </w:rPr>
   </w:style>
-  <w:style w:type="character" w:customStyle="1" w:styleId="WarningTok">
+  <w:style w:customStyle="1" w:styleId="WarningTok" w:type="character">
     <w:name w:val="WarningTok"/>
     <w:basedOn w:val="VerbatimChar"/>
     <w:rPr>
@@ -17947,7 +17993,7 @@
       <w:color w:val="60a0b0"/>
     </w:rPr>
   </w:style>
-  <w:style w:type="character" w:customStyle="1" w:styleId="AlertTok">
+  <w:style w:customStyle="1" w:styleId="AlertTok" w:type="character">
     <w:name w:val="AlertTok"/>
     <w:basedOn w:val="VerbatimChar"/>
     <w:rPr>
@@ -17955,7 +18001,7 @@
       <w:color w:val="ff0000"/>
     </w:rPr>
   </w:style>
-  <w:style w:type="character" w:customStyle="1" w:styleId="ErrorTok">
+  <w:style w:customStyle="1" w:styleId="ErrorTok" w:type="character">
     <w:name w:val="ErrorTok"/>
     <w:basedOn w:val="VerbatimChar"/>
     <w:rPr>
@@ -17963,7 +18009,7 @@
       <w:color w:val="ff0000"/>
     </w:rPr>
   </w:style>
-  <w:style w:type="character" w:customStyle="1" w:styleId="NormalTok">
+  <w:style w:customStyle="1" w:styleId="NormalTok" w:type="character">
     <w:name w:val="NormalTok"/>
     <w:basedOn w:val="VerbatimChar"/>
     <w:rPr/>

</xml_diff>

<commit_message>
docs(deployment): update the procedure and redraw the server topology without crossing lines
</commit_message>
<xml_diff>
--- a/07_PROCEDIMIENTO_DE_IMPLEMENTACION/EN/WORD/07_Implementation_Procedure.docx
+++ b/07_PROCEDIMIENTO_DE_IMPLEMENTACION/EN/WORD/07_Implementation_Procedure.docx
@@ -32,7 +32,7 @@
         <w:pStyle w:val="BodyText"/>
       </w:pPr>
       <w:r>
-        <w:t xml:space="preserve">Brayan Estiven Patiño Cabrera (Project Leader), Juan Camilo Guilombo Osorio (Frontend Leader), and Merari Urbano (Backend Leader)</w:t>
+        <w:t xml:space="preserve">Brayan Estiven Patiño Cabrera (Project Leader), Juan Camilo Guilombo Osorio (Frontend Leader), and Merari Urbano Quintero (Backend Leader)</w:t>
       </w:r>
     </w:p>
     <w:p>
@@ -64,7 +64,7 @@
         <w:pStyle w:val="BodyText"/>
       </w:pPr>
       <w:r>
-        <w:t xml:space="preserve">October 17, 2026</w:t>
+        <w:t xml:space="preserve">October 20, 2026</w:t>
       </w:r>
     </w:p>
     <w:p>
@@ -72,7 +72,7 @@
         <w:pStyle w:val="BodyText"/>
       </w:pPr>
       <w:r>
-        <w:t xml:space="preserve">Document Type: Implementation Procedure (Development Team, IT Administrator, and Business Owner) · Version 2.1</w:t>
+        <w:t xml:space="preserve">Document Type: Implementation Procedure (Development Team, IT Administrator, and Business Owner) · Version 2.3</w:t>
       </w:r>
     </w:p>
     <w:bookmarkStart w:id="20" w:name="version-control"/>
@@ -372,6 +372,52 @@
             </w:pPr>
             <w:r>
               <w:t xml:space="preserve">Continuous integration with GitHub Actions in the 10 repositories and deployment from GitHub: the scope (6.2) and risk R-I09 were updated.</w:t>
+            </w:r>
+          </w:p>
+        </w:tc>
+        <w:tc>
+          <w:tcPr/>
+          <w:p>
+            <w:pPr>
+              <w:pStyle w:val="Compact"/>
+            </w:pPr>
+            <w:r>
+              <w:t xml:space="preserve">Development team</w:t>
+            </w:r>
+          </w:p>
+        </w:tc>
+      </w:tr>
+      <w:tr>
+        <w:tc>
+          <w:tcPr/>
+          <w:p>
+            <w:pPr>
+              <w:pStyle w:val="Compact"/>
+            </w:pPr>
+            <w:r>
+              <w:t xml:space="preserve">2.3</w:t>
+            </w:r>
+          </w:p>
+        </w:tc>
+        <w:tc>
+          <w:tcPr/>
+          <w:p>
+            <w:pPr>
+              <w:pStyle w:val="Compact"/>
+            </w:pPr>
+            <w:r>
+              <w:t xml:space="preserve">2026-10-20</w:t>
+            </w:r>
+          </w:p>
+        </w:tc>
+        <w:tc>
+          <w:tcPr/>
+          <w:p>
+            <w:pPr>
+              <w:pStyle w:val="Compact"/>
+            </w:pPr>
+            <w:r>
+              <w:t xml:space="preserve">Review against the code of October 20, 2026: criterion E2 with the tests of October 19 (655 automated and 19 end-to-end) and RabbitMQ queues corrected (the operations-service queue has no dead-letter queue) and communication plan (the panel does not send general announcements).</w:t>
             </w:r>
           </w:p>
         </w:tc>
@@ -1684,7 +1730,7 @@
               <w:pStyle w:val="Compact"/>
             </w:pPr>
             <w:r>
-              <w:t xml:space="preserve">Backend leader (Merari Urbano)</w:t>
+              <w:t xml:space="preserve">Backend leader (Merari Urbano Quintero)</w:t>
             </w:r>
           </w:p>
         </w:tc>
@@ -4574,7 +4620,7 @@
               <w:pStyle w:val="Compact"/>
             </w:pPr>
             <w:r>
-              <w:t xml:space="preserve">Summaries without failures (on October 16, 2026: 639 unit tests and 19 end-to-end tests).</w:t>
+              <w:t xml:space="preserve">Summaries without failures (on October 19, 2026: 655 automated tests and 19 end-to-end tests).</w:t>
             </w:r>
           </w:p>
         </w:tc>
@@ -7802,7 +7848,10 @@
         <w:t xml:space="preserve">customer-service.events</w:t>
       </w:r>
       <w:r>
-        <w:t xml:space="preserve">,</w:t>
+        <w:t xml:space="preserve"> </w:t>
+      </w:r>
+      <w:r>
+        <w:t xml:space="preserve">and</w:t>
       </w:r>
       <w:r>
         <w:t xml:space="preserve"> </w:t>
@@ -7815,7 +7864,7 @@
         <w:t xml:space="preserve">notification-service.events</w:t>
       </w:r>
       <w:r>
-        <w:t xml:space="preserve">, and</w:t>
+        <w:t xml:space="preserve">, each with its</w:t>
       </w:r>
       <w:r>
         <w:t xml:space="preserve"> </w:t>
@@ -7825,13 +7874,10 @@
           <w:i/>
           <w:iCs/>
         </w:rPr>
-        <w:t xml:space="preserve">operations-service.events</w:t>
-      </w:r>
-      <w:r>
-        <w:t xml:space="preserve"> </w:t>
-      </w:r>
-      <w:r>
-        <w:t xml:space="preserve">with their</w:t>
+        <w:t xml:space="preserve">.dlq</w:t>
+      </w:r>
+      <w:r>
+        <w:t xml:space="preserve">, and</w:t>
       </w:r>
       <w:r>
         <w:t xml:space="preserve"> </w:t>
@@ -7841,10 +7887,10 @@
           <w:i/>
           <w:iCs/>
         </w:rPr>
-        <w:t xml:space="preserve">.dlq</w:t>
-      </w:r>
-      <w:r>
-        <w:t xml:space="preserve">).</w:t>
+        <w:t xml:space="preserve">operations-service.events</w:t>
+      </w:r>
+      <w:r>
+        <w:t xml:space="preserve">, which has no dead-letter queue).</w:t>
       </w:r>
     </w:p>
     <w:p>
@@ -9434,7 +9480,10 @@
               <w:t xml:space="preserve">notification-service.events.dlq</w:t>
             </w:r>
             <w:r>
-              <w:t xml:space="preserve">,</w:t>
+              <w:t xml:space="preserve"> </w:t>
+            </w:r>
+            <w:r>
+              <w:t xml:space="preserve">and</w:t>
             </w:r>
             <w:r>
               <w:t xml:space="preserve"> </w:t>
@@ -9445,19 +9494,6 @@
                 <w:iCs/>
               </w:rPr>
               <w:t xml:space="preserve">customer-service.events.dlq</w:t>
-            </w:r>
-            <w:r>
-              <w:t xml:space="preserve">, and</w:t>
-            </w:r>
-            <w:r>
-              <w:t xml:space="preserve"> </w:t>
-            </w:r>
-            <w:r>
-              <w:rPr>
-                <w:i/>
-                <w:iCs/>
-              </w:rPr>
-              <w:t xml:space="preserve">operations-service.events.dlq</w:t>
             </w:r>
             <w:r>
               <w:t xml:space="preserve"> </w:t>
@@ -12496,17 +12532,7 @@
               <w:pStyle w:val="Compact"/>
             </w:pPr>
             <w:r>
-              <w:t xml:space="preserve">Administrator announcement from the panel (</w:t>
-            </w:r>
-            <w:r>
-              <w:rPr>
-                <w:i/>
-                <w:iCs/>
-              </w:rPr>
-              <w:t xml:space="preserve">SYSTEM_MESSAGE</w:t>
-            </w:r>
-            <w:r>
-              <w:t xml:space="preserve">) and direct message</w:t>
+              <w:t xml:space="preserve">Direct message and notice at the car wash (the web and the app have no screen to send general announcements; improvement action AM-13)</w:t>
             </w:r>
           </w:p>
         </w:tc>

</xml_diff>

<commit_message>
docs(implementation): add the follow-up variables and the to-close smoke test to the English implementation procedure
</commit_message>
<xml_diff>
--- a/07_PROCEDIMIENTO_DE_IMPLEMENTACION/EN/WORD/07_Implementation_Procedure.docx
+++ b/07_PROCEDIMIENTO_DE_IMPLEMENTACION/EN/WORD/07_Implementation_Procedure.docx
@@ -64,7 +64,7 @@
         <w:pStyle w:val="BodyText"/>
       </w:pPr>
       <w:r>
-        <w:t xml:space="preserve">October 20, 2026</w:t>
+        <w:t xml:space="preserve">October 21, 2026</w:t>
       </w:r>
     </w:p>
     <w:p>
@@ -72,7 +72,7 @@
         <w:pStyle w:val="BodyText"/>
       </w:pPr>
       <w:r>
-        <w:t xml:space="preserve">Document Type: Implementation Procedure (Development Team, IT Administrator, and Business Owner) · Version 2.3</w:t>
+        <w:t xml:space="preserve">Document Type: Implementation Procedure (Development Team, IT Administrator, and Business Owner) · Version 2.5</w:t>
       </w:r>
     </w:p>
     <w:bookmarkStart w:id="20" w:name="version-control"/>
@@ -433,6 +433,114 @@
           </w:p>
         </w:tc>
       </w:tr>
+      <w:tr>
+        <w:tc>
+          <w:tcPr/>
+          <w:p>
+            <w:pPr>
+              <w:pStyle w:val="Compact"/>
+            </w:pPr>
+            <w:r>
+              <w:t xml:space="preserve">2.4</w:t>
+            </w:r>
+          </w:p>
+        </w:tc>
+        <w:tc>
+          <w:tcPr/>
+          <w:p>
+            <w:pPr>
+              <w:pStyle w:val="Compact"/>
+            </w:pPr>
+            <w:r>
+              <w:t xml:space="preserve">2026-10-21</w:t>
+            </w:r>
+          </w:p>
+        </w:tc>
+        <w:tc>
+          <w:tcPr/>
+          <w:p>
+            <w:pPr>
+              <w:pStyle w:val="Compact"/>
+            </w:pPr>
+            <w:r>
+              <w:t xml:space="preserve">Review against the code and the server of October 21, 2026: criterion E2 with the tests of that day (689 automated and 19 end-to-end), automatic pre-implementation backup on the public server (phase 3, monitoring, and rollback), smoke test H10 (the token of a closed session stops working), new variables with defaults, app updates without a new APK, and risk R-I11.</w:t>
+            </w:r>
+          </w:p>
+        </w:tc>
+        <w:tc>
+          <w:tcPr/>
+          <w:p>
+            <w:pPr>
+              <w:pStyle w:val="Compact"/>
+            </w:pPr>
+            <w:r>
+              <w:t xml:space="preserve">Development team</w:t>
+            </w:r>
+          </w:p>
+        </w:tc>
+      </w:tr>
+      <w:tr>
+        <w:tc>
+          <w:tcPr/>
+          <w:p>
+            <w:pPr>
+              <w:pStyle w:val="Compact"/>
+            </w:pPr>
+            <w:r>
+              <w:t xml:space="preserve">2.5</w:t>
+            </w:r>
+          </w:p>
+        </w:tc>
+        <w:tc>
+          <w:tcPr/>
+          <w:p>
+            <w:pPr>
+              <w:pStyle w:val="Compact"/>
+            </w:pPr>
+            <w:r>
+              <w:t xml:space="preserve">2026-10-21</w:t>
+            </w:r>
+          </w:p>
+        </w:tc>
+        <w:tc>
+          <w:tcPr/>
+          <w:p>
+            <w:pPr>
+              <w:pStyle w:val="Compact"/>
+            </w:pPr>
+            <w:r>
+              <w:t xml:space="preserve">Review against the code of the evening of October 21, 2026: criterion E2 with the final run of that day (707 automated tests and 19 end-to-end), operations-service</w:t>
+            </w:r>
+            <w:r>
+              <w:t xml:space="preserve"> </w:t>
+            </w:r>
+            <w:r>
+              <w:rPr>
+                <w:i/>
+                <w:iCs/>
+              </w:rPr>
+              <w:t xml:space="preserve">FOLLOW_UP_*</w:t>
+            </w:r>
+            <w:r>
+              <w:t xml:space="preserve"> </w:t>
+            </w:r>
+            <w:r>
+              <w:t xml:space="preserve">variables, smoke test H11 (the administrator's "To close" list), and updated configuration rule. Confirmed bookings with an operator that nobody registered are no longer closed as "No-show" on their own: the administrator resolves them.</w:t>
+            </w:r>
+          </w:p>
+        </w:tc>
+        <w:tc>
+          <w:tcPr/>
+          <w:p>
+            <w:pPr>
+              <w:pStyle w:val="Compact"/>
+            </w:pPr>
+            <w:r>
+              <w:t xml:space="preserve">Development team</w:t>
+            </w:r>
+          </w:p>
+        </w:tc>
+      </w:tr>
     </w:tbl>
     <w:p>
       <w:pPr>
@@ -1358,7 +1466,7 @@
         <w:t xml:space="preserve"> </w:t>
       </w:r>
       <w:r>
-        <w:t xml:space="preserve">branch as of October 17, 2026), especially</w:t>
+        <w:t xml:space="preserve">branch as of October 21, 2026), especially</w:t>
       </w:r>
       <w:r>
         <w:t xml:space="preserve"> </w:t>
@@ -4620,7 +4728,7 @@
               <w:pStyle w:val="Compact"/>
             </w:pPr>
             <w:r>
-              <w:t xml:space="preserve">Summaries without failures (on October 19, 2026: 655 automated tests and 19 end-to-end tests).</w:t>
+              <w:t xml:space="preserve">Summaries without failures (final run of October 21, 2026: 707 automated tests and 19 end-to-end tests).</w:t>
             </w:r>
           </w:p>
         </w:tc>
@@ -4973,7 +5081,52 @@
               <w:t xml:space="preserve"> </w:t>
             </w:r>
             <w:r>
-              <w:t xml:space="preserve">file and output of RESTORE VERIFYONLY.</w:t>
+              <w:t xml:space="preserve">file and output of RESTORE VERIFYONLY; on the public server, the</w:t>
+            </w:r>
+            <w:r>
+              <w:t xml:space="preserve"> </w:t>
+            </w:r>
+            <w:r>
+              <w:rPr>
+                <w:i/>
+                <w:iCs/>
+              </w:rPr>
+              <w:t xml:space="preserve">RESPALDO | OK</w:t>
+            </w:r>
+            <w:r>
+              <w:t xml:space="preserve"> </w:t>
+            </w:r>
+            <w:r>
+              <w:t xml:space="preserve">and</w:t>
+            </w:r>
+            <w:r>
+              <w:t xml:space="preserve"> </w:t>
+            </w:r>
+            <w:r>
+              <w:rPr>
+                <w:i/>
+                <w:iCs/>
+              </w:rPr>
+              <w:t xml:space="preserve">VERIFICACIÓN | OK</w:t>
+            </w:r>
+            <w:r>
+              <w:t xml:space="preserve"> </w:t>
+            </w:r>
+            <w:r>
+              <w:t xml:space="preserve">lines of</w:t>
+            </w:r>
+            <w:r>
+              <w:t xml:space="preserve"> </w:t>
+            </w:r>
+            <w:r>
+              <w:rPr>
+                <w:i/>
+                <w:iCs/>
+              </w:rPr>
+              <w:t xml:space="preserve">~/lavarapido/backups/backup.log</w:t>
+            </w:r>
+            <w:r>
+              <w:t xml:space="preserve">.</w:t>
             </w:r>
           </w:p>
         </w:tc>
@@ -6388,6 +6541,54 @@
           </w:p>
         </w:tc>
       </w:tr>
+      <w:tr>
+        <w:tc>
+          <w:tcPr/>
+          <w:p>
+            <w:pPr>
+              <w:pStyle w:val="Compact"/>
+            </w:pPr>
+            <w:r>
+              <w:t xml:space="preserve">SESSION_CHECK_*, BOOKING_EXPIRY_*, FOLLOW_UP_*</w:t>
+            </w:r>
+          </w:p>
+        </w:tc>
+        <w:tc>
+          <w:tcPr/>
+          <w:p>
+            <w:pPr>
+              <w:pStyle w:val="Compact"/>
+            </w:pPr>
+            <w:r>
+              <w:t xml:space="preserve">Not set.</w:t>
+            </w:r>
+          </w:p>
+        </w:tc>
+        <w:tc>
+          <w:tcPr/>
+          <w:p>
+            <w:pPr>
+              <w:pStyle w:val="Compact"/>
+            </w:pPr>
+            <w:r>
+              <w:t xml:space="preserve">They have defaults (gateway session check on with 30 s and 3 s; cancellation of scheduled bookings that expired without confirmation every 5 minutes, with a 60-minute grace after the end; operations-service follow-up every 5 minutes for bookings that ended and nobody closed, which uses the same grace and</w:t>
+            </w:r>
+            <w:r>
+              <w:t xml:space="preserve"> </w:t>
+            </w:r>
+            <w:r>
+              <w:rPr>
+                <w:i/>
+                <w:iCs/>
+              </w:rPr>
+              <w:t xml:space="preserve">INTERNAL_API_KEY</w:t>
+            </w:r>
+            <w:r>
+              <w:t xml:space="preserve">) and the Compose file does not pass them to the containers.</w:t>
+            </w:r>
+          </w:p>
+        </w:tc>
+      </w:tr>
     </w:tbl>
     <w:p>
       <w:pPr>
@@ -6873,6 +7074,72 @@
     </w:p>
     <w:p>
       <w:pPr>
+        <w:pStyle w:val="BodyText"/>
+      </w:pPr>
+      <w:r>
+        <w:t xml:space="preserve">On the public server this phase is automatic:</w:t>
+      </w:r>
+      <w:r>
+        <w:t xml:space="preserve"> </w:t>
+      </w:r>
+      <w:r>
+        <w:rPr>
+          <w:i/>
+          <w:iCs/>
+        </w:rPr>
+        <w:t xml:space="preserve">deploy/update-server.sh</w:t>
+      </w:r>
+      <w:r>
+        <w:t xml:space="preserve"> </w:t>
+      </w:r>
+      <w:r>
+        <w:t xml:space="preserve">first runs</w:t>
+      </w:r>
+      <w:r>
+        <w:t xml:space="preserve"> </w:t>
+      </w:r>
+      <w:r>
+        <w:rPr>
+          <w:i/>
+          <w:iCs/>
+        </w:rPr>
+        <w:t xml:space="preserve">deploy/backup-db.sh</w:t>
+      </w:r>
+      <w:r>
+        <w:t xml:space="preserve"> </w:t>
+      </w:r>
+      <w:r>
+        <w:t xml:space="preserve">(full backup with a checksum,</w:t>
+      </w:r>
+      <w:r>
+        <w:t xml:space="preserve"> </w:t>
+      </w:r>
+      <w:r>
+        <w:rPr>
+          <w:i/>
+          <w:iCs/>
+        </w:rPr>
+        <w:t xml:space="preserve">RESTORE VERIFYONLY</w:t>
+      </w:r>
+      <w:r>
+        <w:t xml:space="preserve">, and a compressed copy in</w:t>
+      </w:r>
+      <w:r>
+        <w:t xml:space="preserve"> </w:t>
+      </w:r>
+      <w:r>
+        <w:rPr>
+          <w:i/>
+          <w:iCs/>
+        </w:rPr>
+        <w:t xml:space="preserve">~/lavarapido/backups/</w:t>
+      </w:r>
+      <w:r>
+        <w:t xml:space="preserve">, where the last 14 are kept) and, if the backup fails, does not update (Deployment Document, section 3.2). The following steps are for a computer on the local network.</w:t>
+      </w:r>
+    </w:p>
+    <w:p>
+      <w:pPr>
         <w:pStyle w:val="Compact"/>
         <w:numPr>
           <w:ilvl w:val="0"/>
@@ -7195,7 +7462,36 @@
         <w:t xml:space="preserve"> </w:t>
       </w:r>
       <w:r>
-        <w:t xml:space="preserve">name, size, and verification result of the backup.</w:t>
+        <w:t xml:space="preserve">name, size, and verification result of the backup (on the public server, the</w:t>
+      </w:r>
+      <w:r>
+        <w:t xml:space="preserve"> </w:t>
+      </w:r>
+      <w:r>
+        <w:rPr>
+          <w:i/>
+          <w:iCs/>
+        </w:rPr>
+        <w:t xml:space="preserve">RESPALDO | OK</w:t>
+      </w:r>
+      <w:r>
+        <w:t xml:space="preserve"> </w:t>
+      </w:r>
+      <w:r>
+        <w:t xml:space="preserve">line of</w:t>
+      </w:r>
+      <w:r>
+        <w:t xml:space="preserve"> </w:t>
+      </w:r>
+      <w:r>
+        <w:rPr>
+          <w:i/>
+          <w:iCs/>
+        </w:rPr>
+        <w:t xml:space="preserve">backup.log</w:t>
+      </w:r>
+      <w:r>
+        <w:t xml:space="preserve">).</w:t>
       </w:r>
     </w:p>
     <w:bookmarkEnd w:id="41"/>
@@ -8312,7 +8608,33 @@
         <w:t xml:space="preserve">npm run publish:update</w:t>
       </w:r>
       <w:r>
-        <w:t xml:space="preserve">) is not enough, because it only changes the screen code.</w:t>
+        <w:t xml:space="preserve">) is not enough, because it only changes the screen code. The app changes of October 21, 2026 (compressed receipt, QR magnifier, and mandatory update screen) add no native modules and do arrive with</w:t>
+      </w:r>
+      <w:r>
+        <w:t xml:space="preserve"> </w:t>
+      </w:r>
+      <w:r>
+        <w:rPr>
+          <w:i/>
+          <w:iCs/>
+        </w:rPr>
+        <w:t xml:space="preserve">npm run publish:update</w:t>
+      </w:r>
+      <w:r>
+        <w:t xml:space="preserve">; since then, if the server publishes an APK with a higher</w:t>
+      </w:r>
+      <w:r>
+        <w:t xml:space="preserve"> </w:t>
+      </w:r>
+      <w:r>
+        <w:rPr>
+          <w:i/>
+          <w:iCs/>
+        </w:rPr>
+        <w:t xml:space="preserve">versionCode</w:t>
+      </w:r>
+      <w:r>
+        <w:t xml:space="preserve">, the app asks to install it before going on.</w:t>
       </w:r>
     </w:p>
     <w:p>
@@ -9504,6 +9826,96 @@
           </w:p>
         </w:tc>
       </w:tr>
+      <w:tr>
+        <w:tc>
+          <w:tcPr/>
+          <w:p>
+            <w:pPr>
+              <w:pStyle w:val="Compact"/>
+            </w:pPr>
+            <w:r>
+              <w:t xml:space="preserve">H10</w:t>
+            </w:r>
+          </w:p>
+        </w:tc>
+        <w:tc>
+          <w:tcPr/>
+          <w:p>
+            <w:pPr>
+              <w:pStyle w:val="Compact"/>
+            </w:pPr>
+            <w:r>
+              <w:t xml:space="preserve">Sign out and repeat a call with the same token (</w:t>
+            </w:r>
+            <w:r>
+              <w:rPr>
+                <w:i/>
+                <w:iCs/>
+              </w:rPr>
+              <w:t xml:space="preserve">curl -i -H "Authorization: Bearer &lt;token&gt;" https://&lt;domain&gt;/api/v1/bookings/me</w:t>
+            </w:r>
+            <w:r>
+              <w:t xml:space="preserve">).</w:t>
+            </w:r>
+          </w:p>
+        </w:tc>
+        <w:tc>
+          <w:tcPr/>
+          <w:p>
+            <w:pPr>
+              <w:pStyle w:val="Compact"/>
+            </w:pPr>
+            <w:r>
+              <w:t xml:space="preserve">401: the gateway cuts the token of the closed session (version of October 21, 2026 or later).</w:t>
+            </w:r>
+          </w:p>
+        </w:tc>
+      </w:tr>
+      <w:tr>
+        <w:tc>
+          <w:tcPr/>
+          <w:p>
+            <w:pPr>
+              <w:pStyle w:val="Compact"/>
+            </w:pPr>
+            <w:r>
+              <w:t xml:space="preserve">H11</w:t>
+            </w:r>
+          </w:p>
+        </w:tc>
+        <w:tc>
+          <w:tcPr/>
+          <w:p>
+            <w:pPr>
+              <w:pStyle w:val="Compact"/>
+            </w:pPr>
+            <w:r>
+              <w:t xml:space="preserve">With the administrator's token, query the bookings to close (</w:t>
+            </w:r>
+            <w:r>
+              <w:rPr>
+                <w:i/>
+                <w:iCs/>
+              </w:rPr>
+              <w:t xml:space="preserve">GET /api/v1/admin/assignments/to-close</w:t>
+            </w:r>
+            <w:r>
+              <w:t xml:space="preserve">) and open the administrator's home.</w:t>
+            </w:r>
+          </w:p>
+        </w:tc>
+        <w:tc>
+          <w:tcPr/>
+          <w:p>
+            <w:pPr>
+              <w:pStyle w:val="Compact"/>
+            </w:pPr>
+            <w:r>
+              <w:t xml:space="preserve">200 with the list (it may be empty); the "To close" card only appears when something is pending (version of the evening of October 21, 2026 or later).</w:t>
+            </w:r>
+          </w:p>
+        </w:tc>
+      </w:tr>
     </w:tbl>
     <w:p>
       <w:pPr>
@@ -9538,7 +9950,7 @@
         <w:t xml:space="preserve"> </w:t>
       </w:r>
       <w:r>
-        <w:t xml:space="preserve">the nine tests pass. A failure in H1 to H8 triggers the rollback evaluation (section 12).</w:t>
+        <w:t xml:space="preserve">the eleven tests pass. A failure in H1 to H8, H10, or H11 triggers the rollback evaluation (section 12).</w:t>
       </w:r>
     </w:p>
     <w:bookmarkEnd w:id="46"/>
@@ -10335,7 +10747,112 @@
               <w:pStyle w:val="Compact"/>
             </w:pPr>
             <w:r>
-              <w:t xml:space="preserve">File of the day and backup log.</w:t>
+              <w:t xml:space="preserve">File of the day and backup log; on the public server,</w:t>
+            </w:r>
+            <w:r>
+              <w:t xml:space="preserve"> </w:t>
+            </w:r>
+            <w:r>
+              <w:rPr>
+                <w:i/>
+                <w:iCs/>
+              </w:rPr>
+              <w:t xml:space="preserve">tail -5 ~/lavarapido/backups/backup.log</w:t>
+            </w:r>
+            <w:r>
+              <w:t xml:space="preserve"> </w:t>
+            </w:r>
+            <w:r>
+              <w:t xml:space="preserve">with the day's</w:t>
+            </w:r>
+            <w:r>
+              <w:t xml:space="preserve"> </w:t>
+            </w:r>
+            <w:r>
+              <w:rPr>
+                <w:i/>
+                <w:iCs/>
+              </w:rPr>
+              <w:t xml:space="preserve">RESPALDO | OK</w:t>
+            </w:r>
+            <w:r>
+              <w:t xml:space="preserve"> </w:t>
+            </w:r>
+            <w:r>
+              <w:t xml:space="preserve">and</w:t>
+            </w:r>
+            <w:r>
+              <w:t xml:space="preserve"> </w:t>
+            </w:r>
+            <w:r>
+              <w:rPr>
+                <w:i/>
+                <w:iCs/>
+              </w:rPr>
+              <w:t xml:space="preserve">VERIFICACIÓN | OK</w:t>
+            </w:r>
+            <w:r>
+              <w:t xml:space="preserve">, and</w:t>
+            </w:r>
+            <w:r>
+              <w:t xml:space="preserve"> </w:t>
+            </w:r>
+            <w:r>
+              <w:rPr>
+                <w:i/>
+                <w:iCs/>
+              </w:rPr>
+              <w:t xml:space="preserve">grep FALLÓ</w:t>
+            </w:r>
+            <w:r>
+              <w:t xml:space="preserve"> </w:t>
+            </w:r>
+            <w:r>
+              <w:t xml:space="preserve">with no results.</w:t>
+            </w:r>
+          </w:p>
+        </w:tc>
+      </w:tr>
+      <w:tr>
+        <w:tc>
+          <w:tcPr/>
+          <w:p>
+            <w:pPr>
+              <w:pStyle w:val="Compact"/>
+            </w:pPr>
+            <w:r>
+              <w:t xml:space="preserve">Container status (public server)</w:t>
+            </w:r>
+          </w:p>
+        </w:tc>
+        <w:tc>
+          <w:tcPr/>
+          <w:p>
+            <w:pPr>
+              <w:pStyle w:val="Compact"/>
+            </w:pPr>
+            <w:r>
+              <w:rPr>
+                <w:i/>
+                <w:iCs/>
+              </w:rPr>
+              <w:t xml:space="preserve">docker compose ps</w:t>
+            </w:r>
+            <w:r>
+              <w:t xml:space="preserve">: all</w:t>
+            </w:r>
+            <w:r>
+              <w:t xml:space="preserve"> </w:t>
+            </w:r>
+            <w:r>
+              <w:rPr>
+                <w:i/>
+                <w:iCs/>
+              </w:rPr>
+              <w:t xml:space="preserve">healthy</w:t>
+            </w:r>
+            <w:r>
+              <w:t xml:space="preserve">.</w:t>
             </w:r>
           </w:p>
         </w:tc>
@@ -10622,7 +11139,7 @@
               <w:pStyle w:val="Compact"/>
             </w:pPr>
             <w:r>
-              <w:t xml:space="preserve">A smoke test H1 to H8 fails and is not fixed within 30 minutes</w:t>
+              <w:t xml:space="preserve">A smoke test H1 to H8, H10, or H11 fails and is not fixed within 30 minutes</w:t>
             </w:r>
           </w:p>
         </w:tc>
@@ -10806,7 +11323,36 @@
         </w:numPr>
       </w:pPr>
       <w:r>
-        <w:t xml:space="preserve">Restore the pre-implementation backup of phase 3 (Administrator Manual, section 15.2). Liquibase changesets only move forward, so</w:t>
+        <w:t xml:space="preserve">Restore the pre-implementation backup of phase 3 (Administrator Manual, section 15.2). On the public server,</w:t>
+      </w:r>
+      <w:r>
+        <w:t xml:space="preserve"> </w:t>
+      </w:r>
+      <w:r>
+        <w:rPr>
+          <w:i/>
+          <w:iCs/>
+        </w:rPr>
+        <w:t xml:space="preserve">bash deploy/restore-db.sh &lt;backup.bak.gz&gt;</w:t>
+      </w:r>
+      <w:r>
+        <w:t xml:space="preserve"> </w:t>
+      </w:r>
+      <w:r>
+        <w:t xml:space="preserve">is used: it asks to type</w:t>
+      </w:r>
+      <w:r>
+        <w:t xml:space="preserve"> </w:t>
+      </w:r>
+      <w:r>
+        <w:rPr>
+          <w:i/>
+          <w:iCs/>
+        </w:rPr>
+        <w:t xml:space="preserve">RESTAURAR</w:t>
+      </w:r>
+      <w:r>
+        <w:t xml:space="preserve">, first backs up the current database, stops the services, restores, and starts them again. Liquibase changesets only move forward, so</w:t>
       </w:r>
       <w:r>
         <w:t xml:space="preserve"> </w:t>
@@ -11285,7 +11831,43 @@
         <w:t xml:space="preserve">docker-compose.yml</w:t>
       </w:r>
       <w:r>
-        <w:t xml:space="preserve">.</w:t>
+        <w:t xml:space="preserve">. Those of October 21, 2026 (</w:t>
+      </w:r>
+      <w:r>
+        <w:rPr>
+          <w:i/>
+          <w:iCs/>
+        </w:rPr>
+        <w:t xml:space="preserve">SESSION_CHECK_*</w:t>
+      </w:r>
+      <w:r>
+        <w:t xml:space="preserve">,</w:t>
+      </w:r>
+      <w:r>
+        <w:t xml:space="preserve"> </w:t>
+      </w:r>
+      <w:r>
+        <w:rPr>
+          <w:i/>
+          <w:iCs/>
+        </w:rPr>
+        <w:t xml:space="preserve">BOOKING_EXPIRY_*</w:t>
+      </w:r>
+      <w:r>
+        <w:t xml:space="preserve">, and</w:t>
+      </w:r>
+      <w:r>
+        <w:t xml:space="preserve"> </w:t>
+      </w:r>
+      <w:r>
+        <w:rPr>
+          <w:i/>
+          <w:iCs/>
+        </w:rPr>
+        <w:t xml:space="preserve">FOLLOW_UP_*</w:t>
+      </w:r>
+      <w:r>
+        <w:t xml:space="preserve">) do not follow this rule yet (action ACO-14).</w:t>
       </w:r>
     </w:p>
     <w:p>
@@ -11924,7 +12506,7 @@
               <w:pStyle w:val="Compact"/>
             </w:pPr>
             <w:r>
-              <w:t xml:space="preserve">Pre-implementation backup (phase 3) and daily backup.</w:t>
+              <w:t xml:space="preserve">Pre-implementation backup (phase 3) and daily backup, both verified; on the public server they are automatic (Deployment Document, section 3.2).</w:t>
             </w:r>
           </w:p>
         </w:tc>
@@ -12111,7 +12693,74 @@
               <w:pStyle w:val="Compact"/>
             </w:pPr>
             <w:r>
-              <w:t xml:space="preserve">Explain it in the training; real authorization comes from the role in the token.</w:t>
+              <w:t xml:space="preserve">Explain it in the training; real authorization comes from the role in the token, and since October 21, 2026 the roles tab says so.</w:t>
+            </w:r>
+          </w:p>
+        </w:tc>
+      </w:tr>
+      <w:tr>
+        <w:tc>
+          <w:tcPr/>
+          <w:p>
+            <w:pPr>
+              <w:pStyle w:val="Compact"/>
+            </w:pPr>
+            <w:r>
+              <w:t xml:space="preserve">R-I11</w:t>
+            </w:r>
+          </w:p>
+        </w:tc>
+        <w:tc>
+          <w:tcPr/>
+          <w:p>
+            <w:pPr>
+              <w:pStyle w:val="Compact"/>
+            </w:pPr>
+            <w:r>
+              <w:t xml:space="preserve">If security-service does not answer, the gateway lets requests through without confirming the session, and the token of a closed session works until it expires (1 hour at most); with security-service up, up to 30 seconds.</w:t>
+            </w:r>
+          </w:p>
+        </w:tc>
+        <w:tc>
+          <w:tcPr/>
+          <w:p>
+            <w:pPr>
+              <w:pStyle w:val="Compact"/>
+            </w:pPr>
+            <w:r>
+              <w:t xml:space="preserve">Low</w:t>
+            </w:r>
+          </w:p>
+        </w:tc>
+        <w:tc>
+          <w:tcPr/>
+          <w:p>
+            <w:pPr>
+              <w:pStyle w:val="Compact"/>
+            </w:pPr>
+            <w:r>
+              <w:t xml:space="preserve">Medium</w:t>
+            </w:r>
+          </w:p>
+        </w:tc>
+        <w:tc>
+          <w:tcPr/>
+          <w:p>
+            <w:pPr>
+              <w:pStyle w:val="Compact"/>
+            </w:pPr>
+            <w:r>
+              <w:t xml:space="preserve">Check the health of security-service (phase 5 and Table 10) and the gateway log (</w:t>
+            </w:r>
+            <w:r>
+              <w:rPr>
+                <w:i/>
+                <w:iCs/>
+              </w:rPr>
+              <w:t xml:space="preserve">No se pudo confirmar la sesión</w:t>
+            </w:r>
+            <w:r>
+              <w:t xml:space="preserve">).</w:t>
             </w:r>
           </w:p>
         </w:tc>
@@ -15551,9 +16200,30 @@
         <w:br/>
       </w:r>
       <w:r>
+        <w:rPr>
+          <w:rStyle w:val="FunctionTok"/>
+        </w:rPr>
+        <w:t xml:space="preserve">bash</w:t>
+      </w:r>
+      <w:r>
+        <w:rPr>
+          <w:rStyle w:val="NormalTok"/>
+        </w:rPr>
+        <w:t xml:space="preserve"> ~/lavarapido/lavarapido-infra/deploy/backup-db.sh   </w:t>
+      </w:r>
+      <w:r>
+        <w:rPr>
+          <w:rStyle w:val="CommentTok"/>
+        </w:rPr>
+        <w:t xml:space="preserve"># public server (update-server.sh does it by itself)</w:t>
+      </w:r>
+      <w:r>
         <w:br/>
       </w:r>
       <w:r>
+        <w:br/>
+      </w:r>
+      <w:r>
         <w:rPr>
           <w:rStyle w:val="CommentTok"/>
         </w:rPr>
@@ -15828,6 +16498,51 @@
           <w:rStyle w:val="CommentTok"/>
         </w:rPr>
         <w:t xml:space="preserve"># Rollback (see section 12)</w:t>
+      </w:r>
+      <w:r>
+        <w:br/>
+      </w:r>
+      <w:r>
+        <w:rPr>
+          <w:rStyle w:val="FunctionTok"/>
+        </w:rPr>
+        <w:t xml:space="preserve">bash</w:t>
+      </w:r>
+      <w:r>
+        <w:rPr>
+          <w:rStyle w:val="NormalTok"/>
+        </w:rPr>
+        <w:t xml:space="preserve"> ~/lavarapido/lavarapido-infra/deploy/restore-db.sh </w:t>
+      </w:r>
+      <w:r>
+        <w:rPr>
+          <w:rStyle w:val="OperatorTok"/>
+        </w:rPr>
+        <w:t xml:space="preserve">&lt;</w:t>
+      </w:r>
+      <w:r>
+        <w:rPr>
+          <w:rStyle w:val="NormalTok"/>
+        </w:rPr>
+        <w:t xml:space="preserve">backup.bak.gz</w:t>
+      </w:r>
+      <w:r>
+        <w:rPr>
+          <w:rStyle w:val="OperatorTok"/>
+        </w:rPr>
+        <w:t xml:space="preserve">&gt;</w:t>
+      </w:r>
+      <w:r>
+        <w:rPr>
+          <w:rStyle w:val="NormalTok"/>
+        </w:rPr>
+        <w:t xml:space="preserve">   </w:t>
+      </w:r>
+      <w:r>
+        <w:rPr>
+          <w:rStyle w:val="CommentTok"/>
+        </w:rPr>
+        <w:t xml:space="preserve"># public server</w:t>
       </w:r>
       <w:r>
         <w:br/>

</xml_diff>

<commit_message>
docs(procedure): regenerate the PDF and Word
</commit_message>
<xml_diff>
--- a/07_PROCEDIMIENTO_DE_IMPLEMENTACION/EN/WORD/07_Implementation_Procedure.docx
+++ b/07_PROCEDIMIENTO_DE_IMPLEMENTACION/EN/WORD/07_Implementation_Procedure.docx
@@ -64,7 +64,7 @@
         <w:pStyle w:val="BodyText"/>
       </w:pPr>
       <w:r>
-        <w:t xml:space="preserve">October 26, 2026</w:t>
+        <w:t xml:space="preserve">October 27, 2026</w:t>
       </w:r>
     </w:p>
     <w:p>
@@ -72,7 +72,7 @@
         <w:pStyle w:val="BodyText"/>
       </w:pPr>
       <w:r>
-        <w:t xml:space="preserve">Document Type: Implementation Procedure (Development Team, IT Administrator, and Business Owner) · Version 2.9</w:t>
+        <w:t xml:space="preserve">Document Type: Implementation Procedure (Development Team, IT Administrator, and Business Owner) · Version 2.10</w:t>
       </w:r>
     </w:p>
     <w:bookmarkStart w:id="9" w:name="version-control"/>
@@ -1138,6 +1138,139 @@
           </w:p>
         </w:tc>
       </w:tr>
+      <w:tr>
+        <w:tc>
+          <w:tcPr/>
+          <w:p>
+            <w:pPr>
+              <w:pStyle w:val="Compact"/>
+            </w:pPr>
+            <w:r>
+              <w:t xml:space="preserve">2.10</w:t>
+            </w:r>
+          </w:p>
+        </w:tc>
+        <w:tc>
+          <w:tcPr/>
+          <w:p>
+            <w:pPr>
+              <w:pStyle w:val="Compact"/>
+            </w:pPr>
+            <w:r>
+              <w:t xml:space="preserve">2026-10-27</w:t>
+            </w:r>
+          </w:p>
+        </w:tc>
+        <w:tc>
+          <w:tcPr/>
+          <w:p>
+            <w:pPr>
+              <w:pStyle w:val="Compact"/>
+            </w:pPr>
+            <w:r>
+              <w:t xml:space="preserve">Review against</w:t>
+            </w:r>
+            <w:r>
+              <w:t xml:space="preserve"> </w:t>
+            </w:r>
+            <w:r>
+              <w:rPr>
+                <w:i/>
+                <w:iCs/>
+              </w:rPr>
+              <w:t xml:space="preserve">main</w:t>
+            </w:r>
+            <w:r>
+              <w:t xml:space="preserve"> </w:t>
+            </w:r>
+            <w:r>
+              <w:t xml:space="preserve">of October 27, 2026: criterion E2 with that day's tests (1,337, with payment's 17 integration tests in the CI, and 19 of 19 end-to-end), criterion E4 and cloning with versions</w:t>
+            </w:r>
+            <w:r>
+              <w:t xml:space="preserve"> </w:t>
+            </w:r>
+            <w:r>
+              <w:rPr>
+                <w:i/>
+                <w:iCs/>
+              </w:rPr>
+              <w:t xml:space="preserve">v1.1.0</w:t>
+            </w:r>
+            <w:r>
+              <w:t xml:space="preserve">,</w:t>
+            </w:r>
+            <w:r>
+              <w:t xml:space="preserve"> </w:t>
+            </w:r>
+            <w:r>
+              <w:rPr>
+                <w:i/>
+                <w:iCs/>
+              </w:rPr>
+              <w:t xml:space="preserve">v1.1.1</w:t>
+            </w:r>
+            <w:r>
+              <w:t xml:space="preserve">, and</w:t>
+            </w:r>
+            <w:r>
+              <w:t xml:space="preserve"> </w:t>
+            </w:r>
+            <w:r>
+              <w:rPr>
+                <w:i/>
+                <w:iCs/>
+              </w:rPr>
+              <w:t xml:space="preserve">v1.1.2</w:t>
+            </w:r>
+            <w:r>
+              <w:t xml:space="preserve"> </w:t>
+            </w:r>
+            <w:r>
+              <w:t xml:space="preserve">on</w:t>
+            </w:r>
+            <w:r>
+              <w:t xml:space="preserve"> </w:t>
+            </w:r>
+            <w:r>
+              <w:rPr>
+                <w:i/>
+                <w:iCs/>
+              </w:rPr>
+              <w:t xml:space="preserve">main</w:t>
+            </w:r>
+            <w:r>
+              <w:t xml:space="preserve">, protected in the 10 repositories, public server on</w:t>
+            </w:r>
+            <w:r>
+              <w:t xml:space="preserve"> </w:t>
+            </w:r>
+            <w:r>
+              <w:rPr>
+                <w:i/>
+                <w:iCs/>
+              </w:rPr>
+              <w:t xml:space="preserve">main</w:t>
+            </w:r>
+            <w:r>
+              <w:t xml:space="preserve"> </w:t>
+            </w:r>
+            <w:r>
+              <w:t xml:space="preserve">through continuous deployment, and phase 6 check with 58 tables and the current RabbitMQ queues.</w:t>
+            </w:r>
+          </w:p>
+        </w:tc>
+        <w:tc>
+          <w:tcPr/>
+          <w:p>
+            <w:pPr>
+              <w:pStyle w:val="Compact"/>
+            </w:pPr>
+            <w:r>
+              <w:t xml:space="preserve">Development team</w:t>
+            </w:r>
+          </w:p>
+        </w:tc>
+      </w:tr>
     </w:tbl>
     <w:p>
       <w:pPr>
@@ -2081,7 +2214,23 @@
         <w:t xml:space="preserve"> </w:t>
       </w:r>
       <w:r>
-        <w:t xml:space="preserve">branch as of October 21, 2026), especially</w:t>
+        <w:t xml:space="preserve">branch as of October 21, 2026 and, in what was updated later,</w:t>
+      </w:r>
+      <w:r>
+        <w:t xml:space="preserve"> </w:t>
+      </w:r>
+      <w:r>
+        <w:rPr>
+          <w:i/>
+          <w:iCs/>
+        </w:rPr>
+        <w:t xml:space="preserve">main</w:t>
+      </w:r>
+      <w:r>
+        <w:t xml:space="preserve"> </w:t>
+      </w:r>
+      <w:r>
+        <w:t xml:space="preserve">of October 27, 2026), especially</w:t>
       </w:r>
       <w:r>
         <w:t xml:space="preserve"> </w:t>
@@ -5423,7 +5572,7 @@
               <w:pStyle w:val="Compact"/>
             </w:pPr>
             <w:r>
-              <w:t xml:space="preserve">Summaries without failures. Latest</w:t>
+              <w:t xml:space="preserve">Summaries without failures.</w:t>
             </w:r>
             <w:r>
               <w:t xml:space="preserve"> </w:t>
@@ -5433,13 +5582,13 @@
                 <w:i/>
                 <w:iCs/>
               </w:rPr>
-              <w:t xml:space="preserve">develop</w:t>
-            </w:r>
-            <w:r>
-              <w:t xml:space="preserve"> </w:t>
-            </w:r>
-            <w:r>
-              <w:t xml:space="preserve">CI (October 24, 2026): 1,119 automated tests in the web, the gateway, and the six services (11 payment integration tests skipped without SQL Server) and 73 in the mobile app, 1,192 in total; the local end-to-end suite (19 tests) last ran on October 21, 2026, and the remote battery (</w:t>
+              <w:t xml:space="preserve">main</w:t>
+            </w:r>
+            <w:r>
+              <w:t xml:space="preserve"> </w:t>
+            </w:r>
+            <w:r>
+              <w:t xml:space="preserve">CI of October 27, 2026: 1,231 automated tests in the web, the gateway, and the six services (including payment's 17 integration tests, which run in the CI against SQL Server 2022 without skipping any) and 106 in the mobile app, 1,337 in total; the local end-to-end suite (19 tests) passed 19 of 19 on October 27, 2026, already sending the payment mode when booking, and the remote battery (</w:t>
             </w:r>
             <w:r>
               <w:rPr>
@@ -5544,10 +5693,10 @@
                 <w:i/>
                 <w:iCs/>
               </w:rPr>
-              <w:t xml:space="preserve">v1.0.0</w:t>
-            </w:r>
-            <w:r>
-              <w:t xml:space="preserve">) (section 13). As of October 24, 2026,</w:t>
+              <w:t xml:space="preserve">v1.1.0</w:t>
+            </w:r>
+            <w:r>
+              <w:t xml:space="preserve">) (section 13). As of October 27, 2026 the 10 repositories have their release on</w:t>
             </w:r>
             <w:r>
               <w:t xml:space="preserve"> </w:t>
@@ -5557,45 +5706,10 @@
                 <w:i/>
                 <w:iCs/>
               </w:rPr>
-              <w:t xml:space="preserve">v1.0.0</w:t>
-            </w:r>
-            <w:r>
-              <w:t xml:space="preserve"> </w:t>
-            </w:r>
-            <w:r>
-              <w:t xml:space="preserve">exists in 9 repositories (payment-service has it since that day, with its PR #2 merged); the mobile app has no tag yet (PR #1 open) and is implemented from</w:t>
-            </w:r>
-            <w:r>
-              <w:t xml:space="preserve"> </w:t>
-            </w:r>
-            <w:r>
-              <w:rPr>
-                <w:i/>
-                <w:iCs/>
-              </w:rPr>
-              <w:t xml:space="preserve">develop</w:t>
-            </w:r>
-            <w:r>
-              <w:t xml:space="preserve"> </w:t>
-            </w:r>
-            <w:r>
-              <w:t xml:space="preserve">until its first release (exception recorded in the corrective actions document, ACO-24). The public server runs</w:t>
-            </w:r>
-            <w:r>
-              <w:t xml:space="preserve"> </w:t>
-            </w:r>
-            <w:r>
-              <w:rPr>
-                <w:i/>
-                <w:iCs/>
-              </w:rPr>
-              <w:t xml:space="preserve">develop</w:t>
-            </w:r>
-            <w:r>
-              <w:t xml:space="preserve"> </w:t>
-            </w:r>
-            <w:r>
-              <w:t xml:space="preserve">of October 24, which will ship as</w:t>
+              <w:t xml:space="preserve">main</w:t>
+            </w:r>
+            <w:r>
+              <w:t xml:space="preserve">:</w:t>
             </w:r>
             <w:r>
               <w:t xml:space="preserve"> </w:t>
@@ -5608,7 +5722,71 @@
               <w:t xml:space="preserve">v1.1.0</w:t>
             </w:r>
             <w:r>
-              <w:t xml:space="preserve">.</w:t>
+              <w:t xml:space="preserve"> </w:t>
+            </w:r>
+            <w:r>
+              <w:t xml:space="preserve">in the API Gateway, security-service, operations-service, and notification-service;</w:t>
+            </w:r>
+            <w:r>
+              <w:t xml:space="preserve"> </w:t>
+            </w:r>
+            <w:r>
+              <w:rPr>
+                <w:i/>
+                <w:iCs/>
+              </w:rPr>
+              <w:t xml:space="preserve">v1.1.1</w:t>
+            </w:r>
+            <w:r>
+              <w:t xml:space="preserve"> </w:t>
+            </w:r>
+            <w:r>
+              <w:t xml:space="preserve">in customer-service and booking-service; and</w:t>
+            </w:r>
+            <w:r>
+              <w:t xml:space="preserve"> </w:t>
+            </w:r>
+            <w:r>
+              <w:rPr>
+                <w:i/>
+                <w:iCs/>
+              </w:rPr>
+              <w:t xml:space="preserve">v1.1.2</w:t>
+            </w:r>
+            <w:r>
+              <w:t xml:space="preserve"> </w:t>
+            </w:r>
+            <w:r>
+              <w:t xml:space="preserve">in the web, the mobile app, payment-service, and infra.</w:t>
+            </w:r>
+            <w:r>
+              <w:t xml:space="preserve"> </w:t>
+            </w:r>
+            <w:r>
+              <w:rPr>
+                <w:i/>
+                <w:iCs/>
+              </w:rPr>
+              <w:t xml:space="preserve">main</w:t>
+            </w:r>
+            <w:r>
+              <w:t xml:space="preserve"> </w:t>
+            </w:r>
+            <w:r>
+              <w:t xml:space="preserve">is protected in all 10 (it only takes changes through a pull request with one approval and a green CI) and the public server runs</w:t>
+            </w:r>
+            <w:r>
+              <w:t xml:space="preserve"> </w:t>
+            </w:r>
+            <w:r>
+              <w:rPr>
+                <w:i/>
+                <w:iCs/>
+              </w:rPr>
+              <w:t xml:space="preserve">main</w:t>
+            </w:r>
+            <w:r>
+              <w:t xml:space="preserve">, which continuous deployment updates on every merge (Deployment Document, section 4.3.4).</w:t>
             </w:r>
           </w:p>
         </w:tc>
@@ -6212,7 +6390,7 @@
         <w:t xml:space="preserve">side by side and with their original names</w:t>
       </w:r>
       <w:r>
-        <w:t xml:space="preserve">, at the release tag. As of October 24, 2026, tag</w:t>
+        <w:t xml:space="preserve">, at the release tag. As of October 27, 2026 the current versions are</w:t>
       </w:r>
       <w:r>
         <w:t xml:space="preserve"> </w:t>
@@ -6222,13 +6400,13 @@
           <w:i/>
           <w:iCs/>
         </w:rPr>
-        <w:t xml:space="preserve">v1.0.0</w:t>
-      </w:r>
-      <w:r>
-        <w:t xml:space="preserve"> </w:t>
-      </w:r>
-      <w:r>
-        <w:t xml:space="preserve">exists in 9 repositories: payment-service has it since that day (its PR #2 was merged and its</w:t>
+        <w:t xml:space="preserve">v1.1.0</w:t>
+      </w:r>
+      <w:r>
+        <w:t xml:space="preserve"> </w:t>
+      </w:r>
+      <w:r>
+        <w:t xml:space="preserve">(API Gateway, security-service, operations-service, and notification-service),</w:t>
       </w:r>
       <w:r>
         <w:t xml:space="preserve"> </w:t>
@@ -6238,13 +6416,13 @@
           <w:i/>
           <w:iCs/>
         </w:rPr>
-        <w:t xml:space="preserve">main</w:t>
-      </w:r>
-      <w:r>
-        <w:t xml:space="preserve"> </w:t>
-      </w:r>
-      <w:r>
-        <w:t xml:space="preserve">includes the whole</w:t>
+        <w:t xml:space="preserve">v1.1.1</w:t>
+      </w:r>
+      <w:r>
+        <w:t xml:space="preserve"> </w:t>
+      </w:r>
+      <w:r>
+        <w:t xml:space="preserve">(customer-service and booking-service), and</w:t>
       </w:r>
       <w:r>
         <w:t xml:space="preserve"> </w:t>
@@ -6254,10 +6432,13 @@
           <w:i/>
           <w:iCs/>
         </w:rPr>
-        <w:t xml:space="preserve">develop</w:t>
-      </w:r>
-      <w:r>
-        <w:t xml:space="preserve">, so cloning it from</w:t>
+        <w:t xml:space="preserve">v1.1.2</w:t>
+      </w:r>
+      <w:r>
+        <w:t xml:space="preserve"> </w:t>
+      </w:r>
+      <w:r>
+        <w:t xml:space="preserve">(infra, payment-service, and the web); each one is the tip of</w:t>
       </w:r>
       <w:r>
         <w:t xml:space="preserve"> </w:t>
@@ -6267,10 +6448,13 @@
           <w:i/>
           <w:iCs/>
         </w:rPr>
-        <w:t xml:space="preserve">develop</w:t>
-      </w:r>
-      <w:r>
-        <w:t xml:space="preserve">, as in the block below, gives the same result); only the mobile app has no release. The fixes of October 23 and 24 are in</w:t>
+        <w:t xml:space="preserve">main</w:t>
+      </w:r>
+      <w:r>
+        <w:t xml:space="preserve"> </w:t>
+      </w:r>
+      <w:r>
+        <w:t xml:space="preserve">and is what the public server runs, so cloning with</w:t>
       </w:r>
       <w:r>
         <w:t xml:space="preserve"> </w:t>
@@ -6280,10 +6464,13 @@
           <w:i/>
           <w:iCs/>
         </w:rPr>
-        <w:t xml:space="preserve">develop</w:t>
-      </w:r>
-      <w:r>
-        <w:t xml:space="preserve">, which is what runs on the public server since October 24, and will reach</w:t>
+        <w:t xml:space="preserve">-b main</w:t>
+      </w:r>
+      <w:r>
+        <w:t xml:space="preserve"> </w:t>
+      </w:r>
+      <w:r>
+        <w:t xml:space="preserve">gives the same result until another version ships. The operations repository is called</w:t>
       </w:r>
       <w:r>
         <w:t xml:space="preserve"> </w:t>
@@ -6293,13 +6480,13 @@
           <w:i/>
           <w:iCs/>
         </w:rPr>
-        <w:t xml:space="preserve">main</w:t>
-      </w:r>
-      <w:r>
-        <w:t xml:space="preserve"> </w:t>
-      </w:r>
-      <w:r>
-        <w:t xml:space="preserve">with</w:t>
+        <w:t xml:space="preserve">lavarapido-operation-service</w:t>
+      </w:r>
+      <w:r>
+        <w:t xml:space="preserve"> </w:t>
+      </w:r>
+      <w:r>
+        <w:t xml:space="preserve">(singular), and</w:t>
       </w:r>
       <w:r>
         <w:t xml:space="preserve"> </w:t>
@@ -6309,96 +6496,6 @@
           <w:i/>
           <w:iCs/>
         </w:rPr>
-        <w:t xml:space="preserve">v1.1.0</w:t>
-      </w:r>
-      <w:r>
-        <w:t xml:space="preserve">: to install that version earlier, replace</w:t>
-      </w:r>
-      <w:r>
-        <w:t xml:space="preserve"> </w:t>
-      </w:r>
-      <w:r>
-        <w:rPr>
-          <w:i/>
-          <w:iCs/>
-        </w:rPr>
-        <w:t xml:space="preserve">-b v1.0.0</w:t>
-      </w:r>
-      <w:r>
-        <w:t xml:space="preserve"> </w:t>
-      </w:r>
-      <w:r>
-        <w:t xml:space="preserve">with</w:t>
-      </w:r>
-      <w:r>
-        <w:t xml:space="preserve"> </w:t>
-      </w:r>
-      <w:r>
-        <w:rPr>
-          <w:i/>
-          <w:iCs/>
-        </w:rPr>
-        <w:t xml:space="preserve">-b develop</w:t>
-      </w:r>
-      <w:r>
-        <w:t xml:space="preserve"> </w:t>
-      </w:r>
-      <w:r>
-        <w:t xml:space="preserve">(on the public server,</w:t>
-      </w:r>
-      <w:r>
-        <w:t xml:space="preserve"> </w:t>
-      </w:r>
-      <w:r>
-        <w:rPr>
-          <w:i/>
-          <w:iCs/>
-        </w:rPr>
-        <w:t xml:space="preserve">BRANCH=develop</w:t>
-      </w:r>
-      <w:r>
-        <w:t xml:space="preserve">; without it,</w:t>
-      </w:r>
-      <w:r>
-        <w:t xml:space="preserve"> </w:t>
-      </w:r>
-      <w:r>
-        <w:rPr>
-          <w:i/>
-          <w:iCs/>
-        </w:rPr>
-        <w:t xml:space="preserve">setup-server.sh</w:t>
-      </w:r>
-      <w:r>
-        <w:t xml:space="preserve"> </w:t>
-      </w:r>
-      <w:r>
-        <w:t xml:space="preserve">stops because it never downgrades). The operations repository is called</w:t>
-      </w:r>
-      <w:r>
-        <w:t xml:space="preserve"> </w:t>
-      </w:r>
-      <w:r>
-        <w:rPr>
-          <w:i/>
-          <w:iCs/>
-        </w:rPr>
-        <w:t xml:space="preserve">lavarapido-operation-service</w:t>
-      </w:r>
-      <w:r>
-        <w:t xml:space="preserve"> </w:t>
-      </w:r>
-      <w:r>
-        <w:t xml:space="preserve">(singular), and</w:t>
-      </w:r>
-      <w:r>
-        <w:t xml:space="preserve"> </w:t>
-      </w:r>
-      <w:r>
-        <w:rPr>
-          <w:i/>
-          <w:iCs/>
-        </w:rPr>
         <w:t xml:space="preserve">docker-compose.yml</w:t>
       </w:r>
       <w:r>
@@ -6473,7 +6570,7 @@
         <w:rPr>
           <w:rStyle w:val="NormalTok"/>
         </w:rPr>
-        <w:t xml:space="preserve"> lavarapido-infra lavarapido-security-service lavarapido-api-gateway </w:t>
+        <w:t xml:space="preserve"> lavarapido-security-service lavarapido-api-gateway </w:t>
       </w:r>
       <w:r>
         <w:rPr>
@@ -6539,7 +6636,7 @@
         <w:rPr>
           <w:rStyle w:val="NormalTok"/>
         </w:rPr>
-        <w:t xml:space="preserve"> v1.0.0 https://github.com/BrayanCABRERA123/</w:t>
+        <w:t xml:space="preserve"> v1.1.0 https://github.com/BrayanCABRERA123/</w:t>
       </w:r>
       <w:r>
         <w:rPr>
@@ -6587,7 +6684,7 @@
         <w:rPr>
           <w:rStyle w:val="NormalTok"/>
         </w:rPr>
-        <w:t xml:space="preserve"> v1.0.0 https://github.com/camiloguilombo12/lavarapido-customer-service.git</w:t>
+        <w:t xml:space="preserve"> v1.1.2 https://github.com/BrayanCABRERA123/lavarapido-infra.git</w:t>
       </w:r>
       <w:r>
         <w:br/>
@@ -6614,7 +6711,7 @@
         <w:rPr>
           <w:rStyle w:val="NormalTok"/>
         </w:rPr>
-        <w:t xml:space="preserve"> v1.0.0 https://github.com/camiloguilombo12/lavarapido-booking-service.git</w:t>
+        <w:t xml:space="preserve"> v1.1.1 https://github.com/camiloguilombo12/lavarapido-customer-service.git</w:t>
       </w:r>
       <w:r>
         <w:br/>
@@ -6641,19 +6738,40 @@
         <w:rPr>
           <w:rStyle w:val="NormalTok"/>
         </w:rPr>
-        <w:t xml:space="preserve"> develop https://github.com/merari0322/lavarapido-payment-service.git   </w:t>
-      </w:r>
-      <w:r>
-        <w:rPr>
-          <w:rStyle w:val="CommentTok"/>
-        </w:rPr>
-        <w:t xml:space="preserve"># no tag yet</w:t>
+        <w:t xml:space="preserve"> v1.1.1 https://github.com/camiloguilombo12/lavarapido-booking-service.git</w:t>
       </w:r>
       <w:r>
         <w:br/>
       </w:r>
       <w:r>
         <w:rPr>
+          <w:rStyle w:val="FunctionTok"/>
+        </w:rPr>
+        <w:t xml:space="preserve">git</w:t>
+      </w:r>
+      <w:r>
+        <w:rPr>
+          <w:rStyle w:val="NormalTok"/>
+        </w:rPr>
+        <w:t xml:space="preserve"> clone </w:t>
+      </w:r>
+      <w:r>
+        <w:rPr>
+          <w:rStyle w:val="AttributeTok"/>
+        </w:rPr>
+        <w:t xml:space="preserve">-b</w:t>
+      </w:r>
+      <w:r>
+        <w:rPr>
+          <w:rStyle w:val="NormalTok"/>
+        </w:rPr>
+        <w:t xml:space="preserve"> v1.1.2 https://github.com/merari0322/lavarapido-payment-service.git</w:t>
+      </w:r>
+      <w:r>
+        <w:br/>
+      </w:r>
+      <w:r>
+        <w:rPr>
           <w:rStyle w:val="BuiltInTok"/>
         </w:rPr>
         <w:t xml:space="preserve">cd</w:t>
@@ -6737,7 +6855,7 @@
         <w:rPr>
           <w:rStyle w:val="NormalTok"/>
         </w:rPr>
-        <w:t xml:space="preserve"> v1.0.0 https://github.com/BrayanCABRERA123/Front-end-proyecto-web.git</w:t>
+        <w:t xml:space="preserve"> v1.1.2 https://github.com/BrayanCABRERA123/Front-end-proyecto-web.git</w:t>
       </w:r>
     </w:p>
     <w:p>
@@ -9854,7 +9972,7 @@
         </w:numPr>
       </w:pPr>
       <w:r>
-        <w:t xml:space="preserve">Check that the database has 57 tables in the nine schemas (Installation Manual, section 11.5) and that the RabbitMQ topology exists (exchange</w:t>
+        <w:t xml:space="preserve">Check that the database has 58 tables in the nine schemas (Installation Manual, section 11.5) and that the RabbitMQ topology exists: the exchange</w:t>
       </w:r>
       <w:r>
         <w:t xml:space="preserve"> </w:t>
@@ -9867,10 +9985,7 @@
         <w:t xml:space="preserve">carwash.events</w:t>
       </w:r>
       <w:r>
-        <w:t xml:space="preserve"> </w:t>
-      </w:r>
-      <w:r>
-        <w:t xml:space="preserve">and the queues</w:t>
+        <w:t xml:space="preserve">, the dead-letter exchange</w:t>
       </w:r>
       <w:r>
         <w:t xml:space="preserve"> </w:t>
@@ -9880,13 +9995,10 @@
           <w:i/>
           <w:iCs/>
         </w:rPr>
-        <w:t xml:space="preserve">customer-service.events</w:t>
-      </w:r>
-      <w:r>
-        <w:t xml:space="preserve"> </w:t>
-      </w:r>
-      <w:r>
-        <w:t xml:space="preserve">and</w:t>
+        <w:t xml:space="preserve">carwash.events.dlx</w:t>
+      </w:r>
+      <w:r>
+        <w:t xml:space="preserve">, and the queues</w:t>
       </w:r>
       <w:r>
         <w:t xml:space="preserve"> </w:t>
@@ -9896,10 +10008,10 @@
           <w:i/>
           <w:iCs/>
         </w:rPr>
-        <w:t xml:space="preserve">notification-service.events</w:t>
-      </w:r>
-      <w:r>
-        <w:t xml:space="preserve">, each with its</w:t>
+        <w:t xml:space="preserve">customer-service.events</w:t>
+      </w:r>
+      <w:r>
+        <w:t xml:space="preserve">,</w:t>
       </w:r>
       <w:r>
         <w:t xml:space="preserve"> </w:t>
@@ -9909,10 +10021,10 @@
           <w:i/>
           <w:iCs/>
         </w:rPr>
-        <w:t xml:space="preserve">.dlq</w:t>
-      </w:r>
-      <w:r>
-        <w:t xml:space="preserve">, and</w:t>
+        <w:t xml:space="preserve">notification-service.events</w:t>
+      </w:r>
+      <w:r>
+        <w:t xml:space="preserve">,</w:t>
       </w:r>
       <w:r>
         <w:t xml:space="preserve"> </w:t>
@@ -9922,10 +10034,52 @@
           <w:i/>
           <w:iCs/>
         </w:rPr>
+        <w:t xml:space="preserve">operations-service.booking-confirmed</w:t>
+      </w:r>
+      <w:r>
+        <w:t xml:space="preserve">, and</w:t>
+      </w:r>
+      <w:r>
+        <w:t xml:space="preserve"> </w:t>
+      </w:r>
+      <w:r>
+        <w:rPr>
+          <w:i/>
+          <w:iCs/>
+        </w:rPr>
+        <w:t xml:space="preserve">booking.payment-events</w:t>
+      </w:r>
+      <w:r>
+        <w:t xml:space="preserve">, each with its</w:t>
+      </w:r>
+      <w:r>
+        <w:t xml:space="preserve"> </w:t>
+      </w:r>
+      <w:r>
+        <w:rPr>
+          <w:i/>
+          <w:iCs/>
+        </w:rPr>
+        <w:t xml:space="preserve">.dlq</w:t>
+      </w:r>
+      <w:r>
+        <w:t xml:space="preserve">. The old</w:t>
+      </w:r>
+      <w:r>
+        <w:t xml:space="preserve"> </w:t>
+      </w:r>
+      <w:r>
+        <w:rPr>
+          <w:i/>
+          <w:iCs/>
+        </w:rPr>
         <w:t xml:space="preserve">operations-service.events</w:t>
       </w:r>
       <w:r>
-        <w:t xml:space="preserve">, which has no dead-letter queue).</w:t>
+        <w:t xml:space="preserve"> </w:t>
+      </w:r>
+      <w:r>
+        <w:t xml:space="preserve">queue is no longer used: operations-service empties and deletes it at start-up.</w:t>
       </w:r>
     </w:p>
     <w:p>
@@ -13552,7 +13706,7 @@
         <w:t xml:space="preserve">main</w:t>
       </w:r>
       <w:r>
-        <w:t xml:space="preserve">, which has the tagged version; payment-service, while it has no release, from</w:t>
+        <w:t xml:space="preserve">, which has the tagged version and is protected in the 10 repositories; never from a</w:t>
       </w:r>
       <w:r>
         <w:t xml:space="preserve"> </w:t>
@@ -13562,10 +13716,13 @@
           <w:i/>
           <w:iCs/>
         </w:rPr>
-        <w:t xml:space="preserve">develop</w:t>
-      </w:r>
-      <w:r>
-        <w:t xml:space="preserve">; never from a</w:t>
+        <w:t xml:space="preserve">feature/*</w:t>
+      </w:r>
+      <w:r>
+        <w:t xml:space="preserve"> </w:t>
+      </w:r>
+      <w:r>
+        <w:t xml:space="preserve">branch. Since October 26, 2026 the public server runs</w:t>
       </w:r>
       <w:r>
         <w:t xml:space="preserve"> </w:t>
@@ -13575,58 +13732,10 @@
           <w:i/>
           <w:iCs/>
         </w:rPr>
-        <w:t xml:space="preserve">feature/*</w:t>
-      </w:r>
-      <w:r>
-        <w:t xml:space="preserve"> </w:t>
-      </w:r>
-      <w:r>
-        <w:t xml:space="preserve">branch. The public server runs</w:t>
-      </w:r>
-      <w:r>
-        <w:t xml:space="preserve"> </w:t>
-      </w:r>
-      <w:r>
-        <w:rPr>
-          <w:i/>
-          <w:iCs/>
-        </w:rPr>
-        <w:t xml:space="preserve">develop</w:t>
-      </w:r>
-      <w:r>
-        <w:t xml:space="preserve"> </w:t>
-      </w:r>
-      <w:r>
-        <w:t xml:space="preserve">of October 24, 2026 and is updated with</w:t>
-      </w:r>
-      <w:r>
-        <w:t xml:space="preserve"> </w:t>
-      </w:r>
-      <w:r>
-        <w:rPr>
-          <w:i/>
-          <w:iCs/>
-        </w:rPr>
-        <w:t xml:space="preserve">BRANCH=develop</w:t>
-      </w:r>
-      <w:r>
-        <w:t xml:space="preserve"> </w:t>
-      </w:r>
-      <w:r>
-        <w:t xml:space="preserve">until</w:t>
-      </w:r>
-      <w:r>
-        <w:t xml:space="preserve"> </w:t>
-      </w:r>
-      <w:r>
-        <w:rPr>
-          <w:i/>
-          <w:iCs/>
-        </w:rPr>
-        <w:t xml:space="preserve">v1.1.0</w:t>
-      </w:r>
-      <w:r>
-        <w:t xml:space="preserve">; afterwards, continuous deployment deploys</w:t>
+        <w:t xml:space="preserve">main</w:t>
+      </w:r>
+      <w:r>
+        <w:t xml:space="preserve">, and continuous deployment updates it on every approved merge into</w:t>
       </w:r>
       <w:r>
         <w:t xml:space="preserve"> </w:t>

</xml_diff>